<commit_message>
Agregar prompts y recursos a documentacion
</commit_message>
<xml_diff>
--- a/Documentacion_proyecto_cifrado.docx
+++ b/Documentacion_proyecto_cifrado.docx
@@ -558,7 +558,7 @@
           <w:b w:val="0"/>
           <w:sz w:val="21"/>
         </w:rPr>
-        <w:t>9. Conclusion</w:t>
+        <w:t>9. Prompts representativos y recursos utilizados</w:t>
       </w:r>
     </w:p>
     <w:p>
@@ -571,7 +571,20 @@
           <w:b w:val="0"/>
           <w:sz w:val="21"/>
         </w:rPr>
-        <w:t>10. Bibliografia</w:t>
+        <w:t>10. Conclusion</w:t>
+      </w:r>
+    </w:p>
+    <w:p>
+      <w:pPr>
+        <w:spacing w:after="120" w:line="259" w:lineRule="auto"/>
+      </w:pPr>
+      <w:r>
+        <w:rPr>
+          <w:rFonts w:ascii="Arial" w:hAnsi="Arial"/>
+          <w:b w:val="0"/>
+          <w:sz w:val="21"/>
+        </w:rPr>
+        <w:t>11. Bibliografia</w:t>
       </w:r>
     </w:p>
     <w:p>
@@ -2465,6 +2478,652 @@
           <w:b/>
           <w:sz w:val="26"/>
         </w:rPr>
+        <w:t>Prompts representativos y recursos utilizados</w:t>
+      </w:r>
+    </w:p>
+    <w:p>
+      <w:pPr>
+        <w:spacing w:after="120" w:line="259" w:lineRule="auto"/>
+      </w:pPr>
+      <w:r>
+        <w:rPr>
+          <w:rFonts w:ascii="Arial" w:hAnsi="Arial"/>
+          <w:b w:val="0"/>
+          <w:sz w:val="21"/>
+        </w:rPr>
+        <w:t>Durante el desarrollo se usaron instrucciones iterativas para construir, corregir, publicar y documentar el sistema. No se incluyen todos los mensajes textuales, sino los prompts mas significativos agrupados por la intencion de trabajo.</w:t>
+      </w:r>
+    </w:p>
+    <w:tbl>
+      <w:tblPr>
+        <w:tblStyle w:val="TableGrid"/>
+        <w:tblW w:type="auto" w:w="0"/>
+        <w:jc w:val="center"/>
+        <w:tblLook w:firstColumn="1" w:firstRow="1" w:lastColumn="0" w:lastRow="0" w:noHBand="0" w:noVBand="1" w:val="04A0"/>
+      </w:tblPr>
+      <w:tblGrid>
+        <w:gridCol w:w="3264"/>
+        <w:gridCol w:w="3264"/>
+        <w:gridCol w:w="3264"/>
+      </w:tblGrid>
+      <w:tr>
+        <w:tc>
+          <w:tcPr>
+            <w:tcW w:type="dxa" w:w="3264"/>
+            <w:vAlign w:val="top"/>
+          </w:tcPr>
+          <w:p>
+            <w:pPr>
+              <w:spacing w:after="0"/>
+            </w:pPr>
+            <w:r/>
+            <w:r>
+              <w:rPr>
+                <w:rFonts w:ascii="Arial" w:hAnsi="Arial"/>
+                <w:b/>
+                <w:sz w:val="18"/>
+              </w:rPr>
+              <w:t>Prompt</w:t>
+            </w:r>
+          </w:p>
+        </w:tc>
+        <w:tc>
+          <w:tcPr>
+            <w:tcW w:type="dxa" w:w="3264"/>
+            <w:vAlign w:val="top"/>
+          </w:tcPr>
+          <w:p>
+            <w:pPr>
+              <w:spacing w:after="0"/>
+            </w:pPr>
+            <w:r/>
+            <w:r>
+              <w:rPr>
+                <w:rFonts w:ascii="Arial" w:hAnsi="Arial"/>
+                <w:b/>
+                <w:sz w:val="18"/>
+              </w:rPr>
+              <w:t>Instruccion representativa</w:t>
+            </w:r>
+          </w:p>
+        </w:tc>
+        <w:tc>
+          <w:tcPr>
+            <w:tcW w:type="dxa" w:w="3264"/>
+            <w:vAlign w:val="top"/>
+          </w:tcPr>
+          <w:p>
+            <w:pPr>
+              <w:spacing w:after="0"/>
+            </w:pPr>
+            <w:r/>
+            <w:r>
+              <w:rPr>
+                <w:rFonts w:ascii="Arial" w:hAnsi="Arial"/>
+                <w:b/>
+                <w:sz w:val="18"/>
+              </w:rPr>
+              <w:t>Uso dentro del proyecto</w:t>
+            </w:r>
+          </w:p>
+        </w:tc>
+      </w:tr>
+      <w:tr>
+        <w:tc>
+          <w:tcPr>
+            <w:tcW w:type="dxa" w:w="3264"/>
+            <w:vAlign w:val="top"/>
+          </w:tcPr>
+          <w:p>
+            <w:pPr>
+              <w:spacing w:after="0"/>
+            </w:pPr>
+            <w:r/>
+            <w:r>
+              <w:rPr>
+                <w:rFonts w:ascii="Arial" w:hAnsi="Arial"/>
+                <w:b/>
+                <w:sz w:val="18"/>
+              </w:rPr>
+              <w:t>Prompt 1</w:t>
+            </w:r>
+          </w:p>
+        </w:tc>
+        <w:tc>
+          <w:tcPr>
+            <w:tcW w:type="dxa" w:w="3264"/>
+            <w:vAlign w:val="top"/>
+          </w:tcPr>
+          <w:p>
+            <w:pPr>
+              <w:spacing w:after="0"/>
+            </w:pPr>
+            <w:r/>
+            <w:r>
+              <w:rPr>
+                <w:rFonts w:ascii="Arial" w:hAnsi="Arial"/>
+                <w:b w:val="0"/>
+                <w:sz w:val="18"/>
+              </w:rPr>
+              <w:t>Desarrollar una aplicacion en Angular y Bootstrap para cifrar y descifrar mensajes con Cesar y Atbash, siguiendo la rubrica del proyecto.</w:t>
+            </w:r>
+          </w:p>
+        </w:tc>
+        <w:tc>
+          <w:tcPr>
+            <w:tcW w:type="dxa" w:w="3264"/>
+            <w:vAlign w:val="top"/>
+          </w:tcPr>
+          <w:p>
+            <w:pPr>
+              <w:spacing w:after="0"/>
+            </w:pPr>
+            <w:r/>
+            <w:r>
+              <w:rPr>
+                <w:rFonts w:ascii="Arial" w:hAnsi="Arial"/>
+                <w:b w:val="0"/>
+                <w:sz w:val="18"/>
+              </w:rPr>
+              <w:t>Definio la base del proyecto: tecnologias, alcance, metodos de cifrado, descifrado automatico, publicacion web y documentacion segura.</w:t>
+            </w:r>
+          </w:p>
+        </w:tc>
+      </w:tr>
+      <w:tr>
+        <w:tc>
+          <w:tcPr>
+            <w:tcW w:type="dxa" w:w="3264"/>
+            <w:vAlign w:val="top"/>
+          </w:tcPr>
+          <w:p>
+            <w:pPr>
+              <w:spacing w:after="0"/>
+            </w:pPr>
+            <w:r/>
+            <w:r>
+              <w:rPr>
+                <w:rFonts w:ascii="Arial" w:hAnsi="Arial"/>
+                <w:b/>
+                <w:sz w:val="18"/>
+              </w:rPr>
+              <w:t>Prompt 2</w:t>
+            </w:r>
+          </w:p>
+        </w:tc>
+        <w:tc>
+          <w:tcPr>
+            <w:tcW w:type="dxa" w:w="3264"/>
+            <w:vAlign w:val="top"/>
+          </w:tcPr>
+          <w:p>
+            <w:pPr>
+              <w:spacing w:after="0"/>
+            </w:pPr>
+            <w:r/>
+            <w:r>
+              <w:rPr>
+                <w:rFonts w:ascii="Arial" w:hAnsi="Arial"/>
+                <w:b w:val="0"/>
+                <w:sz w:val="18"/>
+              </w:rPr>
+              <w:t>Ajustar la interfaz para que fuera mas compacta, sin titulo innecesario, con el area de cifrado y descifrado visibles y el conjunto de caracteres en una zona inferior.</w:t>
+            </w:r>
+          </w:p>
+        </w:tc>
+        <w:tc>
+          <w:tcPr>
+            <w:tcW w:type="dxa" w:w="3264"/>
+            <w:vAlign w:val="top"/>
+          </w:tcPr>
+          <w:p>
+            <w:pPr>
+              <w:spacing w:after="0"/>
+            </w:pPr>
+            <w:r/>
+            <w:r>
+              <w:rPr>
+                <w:rFonts w:ascii="Arial" w:hAnsi="Arial"/>
+                <w:b w:val="0"/>
+                <w:sz w:val="18"/>
+              </w:rPr>
+              <w:t>Guio el diseno visual final para que la aplicacion fuera directa, facil de presentar y sin elementos que pertenecieran mas al documento que a la pagina.</w:t>
+            </w:r>
+          </w:p>
+        </w:tc>
+      </w:tr>
+      <w:tr>
+        <w:tc>
+          <w:tcPr>
+            <w:tcW w:type="dxa" w:w="3264"/>
+            <w:vAlign w:val="top"/>
+          </w:tcPr>
+          <w:p>
+            <w:pPr>
+              <w:spacing w:after="0"/>
+            </w:pPr>
+            <w:r/>
+            <w:r>
+              <w:rPr>
+                <w:rFonts w:ascii="Arial" w:hAnsi="Arial"/>
+                <w:b/>
+                <w:sz w:val="18"/>
+              </w:rPr>
+              <w:t>Prompt 3</w:t>
+            </w:r>
+          </w:p>
+        </w:tc>
+        <w:tc>
+          <w:tcPr>
+            <w:tcW w:type="dxa" w:w="3264"/>
+            <w:vAlign w:val="top"/>
+          </w:tcPr>
+          <w:p>
+            <w:pPr>
+              <w:spacing w:after="0"/>
+            </w:pPr>
+            <w:r/>
+            <w:r>
+              <w:rPr>
+                <w:rFonts w:ascii="Arial" w:hAnsi="Arial"/>
+                <w:b w:val="0"/>
+                <w:sz w:val="18"/>
+              </w:rPr>
+              <w:t>Corregir el cifrado Cesar para que funcionara con modulos negativos y con rangos validos segun el tamano del alfabeto.</w:t>
+            </w:r>
+          </w:p>
+        </w:tc>
+        <w:tc>
+          <w:tcPr>
+            <w:tcW w:type="dxa" w:w="3264"/>
+            <w:vAlign w:val="top"/>
+          </w:tcPr>
+          <w:p>
+            <w:pPr>
+              <w:spacing w:after="0"/>
+            </w:pPr>
+            <w:r/>
+            <w:r>
+              <w:rPr>
+                <w:rFonts w:ascii="Arial" w:hAnsi="Arial"/>
+                <w:b w:val="0"/>
+                <w:sz w:val="18"/>
+              </w:rPr>
+              <w:t>Permitio mejorar la logica modular y mostrar desplazamientos equivalentes de forma mas clara.</w:t>
+            </w:r>
+          </w:p>
+        </w:tc>
+      </w:tr>
+      <w:tr>
+        <w:tc>
+          <w:tcPr>
+            <w:tcW w:type="dxa" w:w="3264"/>
+            <w:vAlign w:val="top"/>
+          </w:tcPr>
+          <w:p>
+            <w:pPr>
+              <w:spacing w:after="0"/>
+            </w:pPr>
+            <w:r/>
+            <w:r>
+              <w:rPr>
+                <w:rFonts w:ascii="Arial" w:hAnsi="Arial"/>
+                <w:b/>
+                <w:sz w:val="18"/>
+              </w:rPr>
+              <w:t>Prompt 4</w:t>
+            </w:r>
+          </w:p>
+        </w:tc>
+        <w:tc>
+          <w:tcPr>
+            <w:tcW w:type="dxa" w:w="3264"/>
+            <w:vAlign w:val="top"/>
+          </w:tcPr>
+          <w:p>
+            <w:pPr>
+              <w:spacing w:after="0"/>
+            </w:pPr>
+            <w:r/>
+            <w:r>
+              <w:rPr>
+                <w:rFonts w:ascii="Arial" w:hAnsi="Arial"/>
+                <w:b w:val="0"/>
+                <w:sz w:val="18"/>
+              </w:rPr>
+              <w:t>Permitir caracteres raros en el cifrado cuando estuvieran dentro del conjunto de caracteres, pero ignorarlos durante el descifrado automatico si no pertenecian al alfabeto activo.</w:t>
+            </w:r>
+          </w:p>
+        </w:tc>
+        <w:tc>
+          <w:tcPr>
+            <w:tcW w:type="dxa" w:w="3264"/>
+            <w:vAlign w:val="top"/>
+          </w:tcPr>
+          <w:p>
+            <w:pPr>
+              <w:spacing w:after="0"/>
+            </w:pPr>
+            <w:r/>
+            <w:r>
+              <w:rPr>
+                <w:rFonts w:ascii="Arial" w:hAnsi="Arial"/>
+                <w:b w:val="0"/>
+                <w:sz w:val="18"/>
+              </w:rPr>
+              <w:t>Definio el manejo de alfabetos personalizados y evito que simbolos externos afectaran la deteccion automatica.</w:t>
+            </w:r>
+          </w:p>
+        </w:tc>
+      </w:tr>
+      <w:tr>
+        <w:tc>
+          <w:tcPr>
+            <w:tcW w:type="dxa" w:w="3264"/>
+            <w:vAlign w:val="top"/>
+          </w:tcPr>
+          <w:p>
+            <w:pPr>
+              <w:spacing w:after="0"/>
+            </w:pPr>
+            <w:r/>
+            <w:r>
+              <w:rPr>
+                <w:rFonts w:ascii="Arial" w:hAnsi="Arial"/>
+                <w:b/>
+                <w:sz w:val="18"/>
+              </w:rPr>
+              <w:t>Prompt 5</w:t>
+            </w:r>
+          </w:p>
+        </w:tc>
+        <w:tc>
+          <w:tcPr>
+            <w:tcW w:type="dxa" w:w="3264"/>
+            <w:vAlign w:val="top"/>
+          </w:tcPr>
+          <w:p>
+            <w:pPr>
+              <w:spacing w:after="0"/>
+            </w:pPr>
+            <w:r/>
+            <w:r>
+              <w:rPr>
+                <w:rFonts w:ascii="Arial" w:hAnsi="Arial"/>
+                <w:b w:val="0"/>
+                <w:sz w:val="18"/>
+              </w:rPr>
+              <w:t>Documentar el codigo de forma segura usando comentarios de referencia y explicar cada referencia en un documento Word.</w:t>
+            </w:r>
+          </w:p>
+        </w:tc>
+        <w:tc>
+          <w:tcPr>
+            <w:tcW w:type="dxa" w:w="3264"/>
+            <w:vAlign w:val="top"/>
+          </w:tcPr>
+          <w:p>
+            <w:pPr>
+              <w:spacing w:after="0"/>
+            </w:pPr>
+            <w:r/>
+            <w:r>
+              <w:rPr>
+                <w:rFonts w:ascii="Arial" w:hAnsi="Arial"/>
+                <w:b w:val="0"/>
+                <w:sz w:val="18"/>
+              </w:rPr>
+              <w:t>Produjo el esquema de Referencia 1, Referencia 2, etc., separando el codigo de la explicacion detallada para no llenar los archivos fuente de comentarios extensos.</w:t>
+            </w:r>
+          </w:p>
+        </w:tc>
+      </w:tr>
+      <w:tr>
+        <w:tc>
+          <w:tcPr>
+            <w:tcW w:type="dxa" w:w="3264"/>
+            <w:vAlign w:val="top"/>
+          </w:tcPr>
+          <w:p>
+            <w:pPr>
+              <w:spacing w:after="0"/>
+            </w:pPr>
+            <w:r/>
+            <w:r>
+              <w:rPr>
+                <w:rFonts w:ascii="Arial" w:hAnsi="Arial"/>
+                <w:b/>
+                <w:sz w:val="18"/>
+              </w:rPr>
+              <w:t>Prompt 6</w:t>
+            </w:r>
+          </w:p>
+        </w:tc>
+        <w:tc>
+          <w:tcPr>
+            <w:tcW w:type="dxa" w:w="3264"/>
+            <w:vAlign w:val="top"/>
+          </w:tcPr>
+          <w:p>
+            <w:pPr>
+              <w:spacing w:after="0"/>
+            </w:pPr>
+            <w:r/>
+            <w:r>
+              <w:rPr>
+                <w:rFonts w:ascii="Arial" w:hAnsi="Arial"/>
+                <w:b w:val="0"/>
+                <w:sz w:val="18"/>
+              </w:rPr>
+              <w:t>Publicar el programa en GitHub Pages, verificar que funcionara en la liga publica y corregir diferencias entre la version local y la version publicada.</w:t>
+            </w:r>
+          </w:p>
+        </w:tc>
+        <w:tc>
+          <w:tcPr>
+            <w:tcW w:type="dxa" w:w="3264"/>
+            <w:vAlign w:val="top"/>
+          </w:tcPr>
+          <w:p>
+            <w:pPr>
+              <w:spacing w:after="0"/>
+            </w:pPr>
+            <w:r/>
+            <w:r>
+              <w:rPr>
+                <w:rFonts w:ascii="Arial" w:hAnsi="Arial"/>
+                <w:b w:val="0"/>
+                <w:sz w:val="18"/>
+              </w:rPr>
+              <w:t>Aseguro que la entrega tuviera enlace funcional y que GitHub Pages cargara el mismo build de Angular que se veia en local.</w:t>
+            </w:r>
+          </w:p>
+        </w:tc>
+      </w:tr>
+      <w:tr>
+        <w:tc>
+          <w:tcPr>
+            <w:tcW w:type="dxa" w:w="3264"/>
+            <w:vAlign w:val="top"/>
+          </w:tcPr>
+          <w:p>
+            <w:pPr>
+              <w:spacing w:after="0"/>
+            </w:pPr>
+            <w:r/>
+            <w:r>
+              <w:rPr>
+                <w:rFonts w:ascii="Arial" w:hAnsi="Arial"/>
+                <w:b/>
+                <w:sz w:val="18"/>
+              </w:rPr>
+              <w:t>Prompt 7</w:t>
+            </w:r>
+          </w:p>
+        </w:tc>
+        <w:tc>
+          <w:tcPr>
+            <w:tcW w:type="dxa" w:w="3264"/>
+            <w:vAlign w:val="top"/>
+          </w:tcPr>
+          <w:p>
+            <w:pPr>
+              <w:spacing w:after="0"/>
+            </w:pPr>
+            <w:r/>
+            <w:r>
+              <w:rPr>
+                <w:rFonts w:ascii="Arial" w:hAnsi="Arial"/>
+                <w:b w:val="0"/>
+                <w:sz w:val="18"/>
+              </w:rPr>
+              <w:t>Usar como referencia una documentacion en PDF de otro proyecto, sin copiarla, para que el reporte tuviera una estructura mas formal.</w:t>
+            </w:r>
+          </w:p>
+        </w:tc>
+        <w:tc>
+          <w:tcPr>
+            <w:tcW w:type="dxa" w:w="3264"/>
+            <w:vAlign w:val="top"/>
+          </w:tcPr>
+          <w:p>
+            <w:pPr>
+              <w:spacing w:after="0"/>
+            </w:pPr>
+            <w:r/>
+            <w:r>
+              <w:rPr>
+                <w:rFonts w:ascii="Arial" w:hAnsi="Arial"/>
+                <w:b w:val="0"/>
+                <w:sz w:val="18"/>
+              </w:rPr>
+              <w:t>Ayudo a reforzar la organizacion del documento con portada, indice, fundamento tecnico, pruebas, enlaces y bibliografia, conservando redaccion propia.</w:t>
+            </w:r>
+          </w:p>
+        </w:tc>
+      </w:tr>
+    </w:tbl>
+    <w:p>
+      <w:pPr>
+        <w:pStyle w:val="Heading2"/>
+      </w:pPr>
+      <w:r>
+        <w:rPr>
+          <w:rFonts w:ascii="Arial" w:hAnsi="Arial"/>
+          <w:b/>
+          <w:sz w:val="23"/>
+        </w:rPr>
+        <w:t>Recursos utilizados</w:t>
+      </w:r>
+    </w:p>
+    <w:p>
+      <w:pPr>
+        <w:pStyle w:val="ListBullet"/>
+        <w:spacing w:after="60"/>
+      </w:pPr>
+      <w:r>
+        <w:rPr>
+          <w:rFonts w:ascii="Arial" w:hAnsi="Arial"/>
+          <w:b w:val="0"/>
+          <w:sz w:val="21"/>
+        </w:rPr>
+        <w:t>Rubrica e instrucciones del proyecto: se usaron como guia principal para cubrir portada, indice, introduccion, objetivo, desarrollo, publicacion, conclusion y bibliografia.</w:t>
+      </w:r>
+    </w:p>
+    <w:p>
+      <w:pPr>
+        <w:pStyle w:val="ListBullet"/>
+        <w:spacing w:after="60"/>
+      </w:pPr>
+      <w:r>
+        <w:rPr>
+          <w:rFonts w:ascii="Arial" w:hAnsi="Arial"/>
+          <w:b w:val="0"/>
+          <w:sz w:val="21"/>
+        </w:rPr>
+        <w:t>Angular: se uso para construir la aplicacion web, separar componentes y mantener la logica de cifrado en archivos TypeScript.</w:t>
+      </w:r>
+    </w:p>
+    <w:p>
+      <w:pPr>
+        <w:pStyle w:val="ListBullet"/>
+        <w:spacing w:after="60"/>
+      </w:pPr>
+      <w:r>
+        <w:rPr>
+          <w:rFonts w:ascii="Arial" w:hAnsi="Arial"/>
+          <w:b w:val="0"/>
+          <w:sz w:val="21"/>
+        </w:rPr>
+        <w:t>Bootstrap: se uso para formularios, botones, rejilla responsiva y estilos base de la interfaz.</w:t>
+      </w:r>
+    </w:p>
+    <w:p>
+      <w:pPr>
+        <w:pStyle w:val="ListBullet"/>
+        <w:spacing w:after="60"/>
+      </w:pPr>
+      <w:r>
+        <w:rPr>
+          <w:rFonts w:ascii="Arial" w:hAnsi="Arial"/>
+          <w:b w:val="0"/>
+          <w:sz w:val="21"/>
+        </w:rPr>
+        <w:t>GitHub y GitHub Pages: se usaron para alojar el codigo fuente y publicar la version web del programa.</w:t>
+      </w:r>
+    </w:p>
+    <w:p>
+      <w:pPr>
+        <w:pStyle w:val="ListBullet"/>
+        <w:spacing w:after="60"/>
+      </w:pPr>
+      <w:r>
+        <w:rPr>
+          <w:rFonts w:ascii="Arial" w:hAnsi="Arial"/>
+          <w:b w:val="0"/>
+          <w:sz w:val="21"/>
+        </w:rPr>
+        <w:t>Documento PDF de referencia: se reviso como ejemplo de estructura de reporte tecnico, sin copiar texto ni codigo.</w:t>
+      </w:r>
+    </w:p>
+    <w:p>
+      <w:pPr>
+        <w:pStyle w:val="ListBullet"/>
+        <w:spacing w:after="60"/>
+      </w:pPr>
+      <w:r>
+        <w:rPr>
+          <w:rFonts w:ascii="Arial" w:hAnsi="Arial"/>
+          <w:b w:val="0"/>
+          <w:sz w:val="21"/>
+        </w:rPr>
+        <w:t>Pruebas locales: se usaron npm test y npm run build para validar que el proyecto compilara y que las pruebas del cifrado pasaran.</w:t>
+      </w:r>
+    </w:p>
+    <w:p>
+      <w:pPr>
+        <w:pStyle w:val="ListBullet"/>
+        <w:spacing w:after="60"/>
+      </w:pPr>
+      <w:r>
+        <w:rPr>
+          <w:rFonts w:ascii="Arial" w:hAnsi="Arial"/>
+          <w:b w:val="0"/>
+          <w:sz w:val="21"/>
+        </w:rPr>
+        <w:t>Navegador local y GitHub Pages: se usaron para verificar que la aplicacion cifrara, descifrara y mostrara correctamente el resultado publicado.</w:t>
+      </w:r>
+    </w:p>
+    <w:p>
+      <w:pPr>
+        <w:pStyle w:val="Heading1"/>
+      </w:pPr>
+      <w:r>
+        <w:rPr>
+          <w:rFonts w:ascii="Arial" w:hAnsi="Arial"/>
+          <w:b/>
+          <w:sz w:val="26"/>
+        </w:rPr>
         <w:t>Conclusion</w:t>
       </w:r>
     </w:p>

</xml_diff>